<commit_message>
feat: implémentation architecture agentique et dialogue itératif
</commit_message>
<xml_diff>
--- a/rapport_technique.docx
+++ b/rapport_technique.docx
@@ -69,6 +69,45 @@
     </w:p>
     <w:p>
       <w:pPr>
+        <w:pStyle w:val="BodyText"/>
+        <w:rPr>
+          <w:lang w:val="fr-FR"/>
+        </w:rPr>
+      </w:pPr>
+      <w:hyperlink r:id="rId5" w:history="1">
+        <w:r>
+          <w:rPr>
+            <w:rStyle w:val="Hyperlink"/>
+            <w:lang w:val="fr-FR"/>
+          </w:rPr>
+          <w:t>https://github.com/AIEngOc2025/agent-triage-hosp</w:t>
+        </w:r>
+        <w:r>
+          <w:rPr>
+            <w:rStyle w:val="Hyperlink"/>
+            <w:lang w:val="fr-FR"/>
+          </w:rPr>
+          <w:t>i</w:t>
+        </w:r>
+        <w:r>
+          <w:rPr>
+            <w:rStyle w:val="Hyperlink"/>
+            <w:lang w:val="fr-FR"/>
+          </w:rPr>
+          <w:t>talier</w:t>
+        </w:r>
+      </w:hyperlink>
+    </w:p>
+    <w:p>
+      <w:pPr>
+        <w:pStyle w:val="BodyText"/>
+        <w:rPr>
+          <w:lang w:val="fr-FR"/>
+        </w:rPr>
+      </w:pPr>
+    </w:p>
+    <w:p>
+      <w:pPr>
         <w:pStyle w:val="FirstParagraph"/>
         <w:rPr>
           <w:lang w:val="fr-FR"/>
@@ -76,15 +115,16 @@
       </w:pPr>
       <w:r>
         <w:rPr>
-          <w:lang w:val="fr-FR"/>
-        </w:rPr>
-        <w:t xml:space="preserve">Objet : </w:t>
-      </w:r>
-      <w:r>
-        <w:rPr>
-          <w:lang w:val="fr-FR"/>
-        </w:rPr>
-        <w:t xml:space="preserve"> corrections factuelles (CHSA) + campagnes benchmark + CI/CD manuel + parité API validée + schéma d’architecture + modèles de latence</w:t>
+          <w:u w:val="single"/>
+          <w:lang w:val="fr-FR"/>
+        </w:rPr>
+        <w:t>Objet </w:t>
+      </w:r>
+      <w:r>
+        <w:rPr>
+          <w:lang w:val="fr-FR"/>
+        </w:rPr>
+        <w:t>:  corrections factuelles (CHSA) + campagnes benchmark + CI/CD manuel + parité API validée + schéma d’architecture + modèles de latence</w:t>
       </w:r>
     </w:p>
     <w:p>
@@ -283,6 +323,7 @@
         <w:rPr>
           <w:lang w:val="fr-FR"/>
         </w:rPr>
+        <w:lastRenderedPageBreak/>
         <w:t>Phase 3 : Projection Industrielle : En cas de validation concluante du POC, passage à des modèles de plus grande envergure (32B+ paramètres) avec des jeux de données étendus pour la mise en production.</w:t>
       </w:r>
     </w:p>
@@ -300,7 +341,6 @@
         <w:rPr>
           <w:lang w:val="fr-FR"/>
         </w:rPr>
-        <w:lastRenderedPageBreak/>
         <w:t>2. Architecture Technique Globale</w:t>
       </w:r>
     </w:p>
@@ -549,6 +589,7 @@
           <w:rStyle w:val="VerbatimChar"/>
           <w:lang w:val="fr-FR"/>
         </w:rPr>
+        <w:lastRenderedPageBreak/>
         <w:t xml:space="preserve">    </w:t>
       </w:r>
       <w:r>
@@ -572,7 +613,7 @@
                     <pic:cNvPicPr/>
                   </pic:nvPicPr>
                   <pic:blipFill>
-                    <a:blip r:embed="rId5">
+                    <a:blip r:embed="rId6">
                       <a:extLst>
                         <a:ext uri="{28A0092B-C50C-407E-A947-70E740481C1C}">
                           <a14:useLocalDpi xmlns:a14="http://schemas.microsoft.com/office/drawing/2010/main" val="0"/>
@@ -608,7 +649,6 @@
         <w:rPr>
           <w:lang w:val="fr-FR"/>
         </w:rPr>
-        <w:lastRenderedPageBreak/>
         <w:br/>
       </w:r>
       <w:r>
@@ -1033,13 +1073,14 @@
       <w:pPr>
         <w:pStyle w:val="FirstParagraph"/>
         <w:rPr>
-          <w:lang w:val="en-GB"/>
-        </w:rPr>
-      </w:pPr>
-      <w:r>
-        <w:rPr>
-          <w:lang w:val="en-GB"/>
-        </w:rPr>
+          <w:lang w:val="fr-FR"/>
+        </w:rPr>
+      </w:pPr>
+      <w:r>
+        <w:rPr>
+          <w:lang w:val="fr-FR"/>
+        </w:rPr>
+        <w:lastRenderedPageBreak/>
         <w:t xml:space="preserve">* L’API Gateway communique avec l’Inference Engine via HTTP(S). </w:t>
       </w:r>
     </w:p>
@@ -1209,14 +1250,7 @@
         <w:rPr>
           <w:lang w:val="fr-FR"/>
         </w:rPr>
-        <w:t xml:space="preserve"> du modèle. Ce paramètre est crucial pour la compatibilité avec certaines architectures de modèles (comme Qwen2.5/Qwen3) et des frameworks d’inférence (comme vLLM ou MLX), qui peuvent nécessiter cette valeur spécifique pour un </w:t>
-      </w:r>
-      <w:r>
-        <w:rPr>
-          <w:lang w:val="fr-FR"/>
-        </w:rPr>
-        <w:lastRenderedPageBreak/>
-        <w:t>fonctionnement correct et des performances optimales. Sans ce patch, le modèle pourrait ne pas se charger ou générer des résultats incohérents.</w:t>
+        <w:t xml:space="preserve"> du modèle. Ce paramètre est crucial pour la compatibilité avec certaines architectures de modèles (comme Qwen2.5/Qwen3) et des frameworks d’inférence (comme vLLM ou MLX), qui peuvent nécessiter cette valeur spécifique pour un fonctionnement correct et des performances optimales. Sans ce patch, le modèle pourrait ne pas se charger ou générer des résultats incohérents.</w:t>
       </w:r>
     </w:p>
     <w:p>
@@ -1527,6 +1561,7 @@
         <w:rPr>
           <w:lang w:val="fr-FR"/>
         </w:rPr>
+        <w:lastRenderedPageBreak/>
         <w:t xml:space="preserve">Les métriques d’anonymisation (nombre d’occurrences de tags comme </w:t>
       </w:r>
       <w:r>
@@ -1801,7 +1836,6 @@
         </w:numPr>
       </w:pPr>
       <w:r>
-        <w:lastRenderedPageBreak/>
         <w:t>Métriques :</w:t>
       </w:r>
     </w:p>
@@ -1958,7 +1992,14 @@
         <w:rPr>
           <w:lang w:val="fr-FR"/>
         </w:rPr>
-        <w:t>Simulation de soutenance (Dr. Dubois) : Des tests de mise en situation ont été réalisés en interprétant le rôle du Dr. Dubois, permettant de challenger l’agent sur des cas complexes, de détecter des biais potentiels et d’ajuster le comportement conversationnel (concision, empathie) pour répondre aux attentes cliniques.</w:t>
+        <w:t xml:space="preserve">Simulation de soutenance (Dr. Dubois) : Des tests de mise en situation ont été réalisés en interprétant le rôle du Dr. Dubois, permettant de challenger l’agent sur </w:t>
+      </w:r>
+      <w:r>
+        <w:rPr>
+          <w:lang w:val="fr-FR"/>
+        </w:rPr>
+        <w:lastRenderedPageBreak/>
+        <w:t>des cas complexes, de détecter des biais potentiels et d’ajuster le comportement conversationnel (concision, empathie) pour répondre aux attentes cliniques.</w:t>
       </w:r>
     </w:p>
     <w:p>
@@ -2179,13 +2220,8 @@
     </w:tbl>
     <w:p>
       <w:r>
-        <w:rPr>
-          <w:noProof/>
-        </w:rPr>
-      </w:r>
-      <w:r>
-        <w:pict w14:anchorId="19867503">
-          <v:rect id="Horizontal Line 1" o:spid="_x0000_s1026" style="width:468pt;height:1.1pt;visibility:visible;mso-wrap-style:square;mso-left-percent:-10001;mso-top-percent:-10001;mso-position-horizontal:absolute;mso-position-horizontal-relative:char;mso-position-vertical:absolute;mso-position-vertical-relative:line;mso-left-percent:-10001;mso-top-percent:-10001;v-text-anchor:top" o:gfxdata="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" filled="f">
+        <w:pict w14:anchorId="79F63E7E">
+          <v:rect id="Horizontal Line 1" o:spid="_x0000_s1026" alt="" style="width:468pt;height:1.1pt;visibility:visible;mso-wrap-style:square;mso-width-percent:0;mso-height-percent:0;mso-left-percent:-10001;mso-top-percent:-10001;mso-position-horizontal:absolute;mso-position-horizontal-relative:char;mso-position-vertical:absolute;mso-position-vertical-relative:line;mso-width-percent:0;mso-height-percent:0;mso-left-percent:-10001;mso-top-percent:-10001;v-text-anchor:top" filled="f">
             <o:lock v:ext="edit" rotation="t" aspectratio="t" verticies="t" text="t" shapetype="t"/>
             <w10:anchorlock/>
           </v:rect>
@@ -2206,7 +2242,6 @@
         <w:rPr>
           <w:lang w:val="fr-FR"/>
         </w:rPr>
-        <w:lastRenderedPageBreak/>
         <w:t>3.2.5 Implémentation du “Guided Decoding” (déprécié)</w:t>
       </w:r>
     </w:p>
@@ -2478,6 +2513,7 @@
         <w:rPr>
           <w:lang w:val="fr-FR"/>
         </w:rPr>
+        <w:lastRenderedPageBreak/>
         <w:t>3.2.2. Anonymisation et Conformité RGPD (</w:t>
       </w:r>
       <w:r>
@@ -2889,7 +2925,6 @@
         <w:rPr>
           <w:lang w:val="fr-FR"/>
         </w:rPr>
-        <w:lastRenderedPageBreak/>
         <w:t>Anonymisation Avant Log : L’entrée utilisateur (</w:t>
       </w:r>
       <w:r>
@@ -3370,6 +3405,7 @@
         <w:rPr>
           <w:lang w:val="fr-FR"/>
         </w:rPr>
+        <w:lastRenderedPageBreak/>
         <w:t>3.2.6. Intercepteurs Runtime (audit_ref dédiés)</w:t>
       </w:r>
     </w:p>
@@ -3648,15 +3684,7 @@
                 <w:rStyle w:val="VerbatimChar"/>
                 <w:lang w:val="fr-FR"/>
               </w:rPr>
-              <w:t xml:space="preserve">{message, niveau: "maximale", orientation: "Urgence vitale </w:t>
-            </w:r>
-            <w:r>
-              <w:rPr>
-                <w:rStyle w:val="VerbatimChar"/>
-                <w:lang w:val="fr-FR"/>
-              </w:rPr>
-              <w:lastRenderedPageBreak/>
-              <w:t>immédiate : SAMU (15) ou urgences."}</w:t>
+              <w:t>{message, niveau: "maximale", orientation: "Urgence vitale immédiate : SAMU (15) ou urgences."}</w:t>
             </w:r>
           </w:p>
           <w:p>
@@ -3678,7 +3706,6 @@
               <w:jc w:val="center"/>
             </w:pPr>
             <w:r>
-              <w:lastRenderedPageBreak/>
               <w:t>~2 ms</w:t>
             </w:r>
           </w:p>
@@ -3859,6 +3886,7 @@
         <w:rPr>
           <w:lang w:val="fr-FR"/>
         </w:rPr>
+        <w:lastRenderedPageBreak/>
         <w:t>* Optimisation : vLLM utilise des techniques comme PagedAttention pour maximiser le débit et minimiser la latence, essentielles pour une application de triage en temps réel.</w:t>
       </w:r>
     </w:p>
@@ -4082,7 +4110,6 @@
         <w:rPr>
           <w:lang w:val="fr-FR"/>
         </w:rPr>
-        <w:lastRenderedPageBreak/>
         <w:t xml:space="preserve">Fonctionnalité : Maintient l’historique de conversation via </w:t>
       </w:r>
       <w:r>
@@ -4274,13 +4301,7 @@
         <w:rPr>
           <w:lang w:val="fr-FR"/>
         </w:rPr>
-        <w:t>(IaaC)</w:t>
-      </w:r>
-      <w:r>
-        <w:rPr>
-          <w:lang w:val="fr-FR"/>
-        </w:rPr>
-        <w:t xml:space="preserve"> </w:t>
+        <w:t xml:space="preserve">(IaaC) </w:t>
       </w:r>
       <w:r>
         <w:rPr>
@@ -4455,6 +4476,7 @@
         <w:rPr>
           <w:lang w:val="fr-FR"/>
         </w:rPr>
+        <w:lastRenderedPageBreak/>
         <w:t>* Master (</w:t>
       </w:r>
       <w:r>
@@ -4789,7 +4811,6 @@
               <w:pStyle w:val="Compact"/>
             </w:pPr>
             <w:r>
-              <w:lastRenderedPageBreak/>
               <w:t>deploy</w:t>
             </w:r>
           </w:p>
@@ -5243,6 +5264,7 @@
           <w:rStyle w:val="CommentTok"/>
           <w:lang w:val="fr-FR"/>
         </w:rPr>
+        <w:lastRenderedPageBreak/>
         <w:t># Tous les microservices</w:t>
       </w:r>
       <w:r>
@@ -5508,7 +5530,6 @@
           <w:rStyle w:val="VerbatimChar"/>
           <w:lang w:val="fr-FR"/>
         </w:rPr>
-        <w:lastRenderedPageBreak/>
         <w:t>docs</w:t>
       </w:r>
       <w:r>
@@ -6043,6 +6064,7 @@
               <w:pStyle w:val="Compact"/>
             </w:pPr>
             <w:r>
+              <w:lastRenderedPageBreak/>
               <w:t>Perte de Validation (DPO)</w:t>
             </w:r>
           </w:p>
@@ -6413,11 +6435,7 @@
               <w:pStyle w:val="Compact"/>
             </w:pPr>
             <w:r>
-              <w:t xml:space="preserve">Latence API </w:t>
-            </w:r>
-            <w:r>
-              <w:lastRenderedPageBreak/>
-              <w:t>Gateway (cloud)</w:t>
+              <w:t>Latence API Gateway (cloud)</w:t>
             </w:r>
           </w:p>
         </w:tc>
@@ -6430,12 +6448,7 @@
               <w:pStyle w:val="Compact"/>
             </w:pPr>
             <w:r>
-              <w:lastRenderedPageBreak/>
-              <w:t xml:space="preserve">&lt; 1500ms </w:t>
-            </w:r>
-            <w:r>
-              <w:lastRenderedPageBreak/>
-              <w:t>(p95)</w:t>
+              <w:t>&lt; 1500ms (p95)</w:t>
             </w:r>
           </w:p>
         </w:tc>
@@ -6448,7 +6461,6 @@
               <w:pStyle w:val="Compact"/>
             </w:pPr>
             <w:r>
-              <w:lastRenderedPageBreak/>
               <w:t>984 ms (p95)</w:t>
             </w:r>
           </w:p>
@@ -6465,14 +6477,7 @@
               <w:rPr>
                 <w:rStyle w:val="VerbatimChar"/>
               </w:rPr>
-              <w:t>scripts/benchmark/b</w:t>
-            </w:r>
-            <w:r>
-              <w:rPr>
-                <w:rStyle w:val="VerbatimChar"/>
-              </w:rPr>
-              <w:lastRenderedPageBreak/>
-              <w:t>enchmark_cloud.py</w:t>
+              <w:t>scripts/benchmark/benchmark_cloud.py</w:t>
             </w:r>
           </w:p>
         </w:tc>
@@ -6487,7 +6492,6 @@
               <w:pStyle w:val="Compact"/>
             </w:pPr>
             <w:r>
-              <w:lastRenderedPageBreak/>
               <w:t>Taux de réussite (cloud)</w:t>
             </w:r>
           </w:p>
@@ -6998,6 +7002,7 @@
               <w:pStyle w:val="Compact"/>
             </w:pPr>
             <w:r>
+              <w:lastRenderedPageBreak/>
               <w:t>Latence p99</w:t>
             </w:r>
           </w:p>
@@ -7382,7 +7387,6 @@
         <w:rPr>
           <w:lang w:val="fr-FR"/>
         </w:rPr>
-        <w:lastRenderedPageBreak/>
         <w:t>Environnement cloud (</w:t>
       </w:r>
       <w:r>
@@ -7773,6 +7777,7 @@
               <w:pStyle w:val="Compact"/>
             </w:pPr>
             <w:r>
+              <w:lastRenderedPageBreak/>
               <w:t>Métrique</w:t>
             </w:r>
           </w:p>
@@ -8227,7 +8232,6 @@
               <w:rPr>
                 <w:rStyle w:val="VerbatimChar"/>
               </w:rPr>
-              <w:lastRenderedPageBreak/>
               <w:t>symptôme</w:t>
             </w:r>
           </w:p>
@@ -8650,7 +8654,14 @@
         <w:rPr>
           <w:lang w:val="fr-FR"/>
         </w:rPr>
-        <w:t>) qui renvoie un triage préformaté. Les benchmarks avec un LLM réel (vLLM service) sont à conduire sur des prompts non-interceptés pour mesurer la latence end-to-end. La campagne #2 confirme la résilience de l’API Cloud après correction : 100 % de réussite, latence stable autour de 900 ms qui est cohérente avec un appel LLM distant via réseau inter-régional.</w:t>
+        <w:t xml:space="preserve">) qui renvoie un triage préformaté. Les benchmarks avec un LLM réel (vLLM service) sont à conduire sur des prompts non-interceptés pour mesurer la </w:t>
+      </w:r>
+      <w:r>
+        <w:rPr>
+          <w:lang w:val="fr-FR"/>
+        </w:rPr>
+        <w:lastRenderedPageBreak/>
+        <w:t>latence end-to-end. La campagne #2 confirme la résilience de l’API Cloud après correction : 100 % de réussite, latence stable autour de 900 ms qui est cohérente avec un appel LLM distant via réseau inter-régional.</w:t>
       </w:r>
     </w:p>
     <w:p>
@@ -9004,14 +9015,7 @@
         <w:rPr>
           <w:lang w:val="fr-FR"/>
         </w:rPr>
-        <w:t xml:space="preserve">, plus ~50 ms de réseau Cloud Run). Les benchmarks mesurent la latence observée (appel → réponse), pas la latence réseau pure. Une cible réaliste serait &lt; 1500 ms </w:t>
-      </w:r>
-      <w:r>
-        <w:rPr>
-          <w:lang w:val="fr-FR"/>
-        </w:rPr>
-        <w:lastRenderedPageBreak/>
-        <w:t xml:space="preserve">p95 pour un appel LLM distant avec intercepteurs activés. Recommandation : mettre à jour la cible dans </w:t>
+        <w:t xml:space="preserve">, plus ~50 ms de réseau Cloud Run). Les benchmarks mesurent la latence observée (appel → réponse), pas la latence réseau pure. Une cible réaliste serait &lt; 1500 ms p95 pour un appel LLM distant avec intercepteurs activés. Recommandation : mettre à jour la cible dans </w:t>
       </w:r>
       <w:r>
         <w:rPr>
@@ -9402,6 +9406,7 @@
               <w:pStyle w:val="Compact"/>
             </w:pPr>
             <w:r>
+              <w:lastRenderedPageBreak/>
               <w:t>T_api_validate</w:t>
             </w:r>
           </w:p>
@@ -9660,7 +9665,6 @@
               <w:pStyle w:val="Compact"/>
             </w:pPr>
             <w:r>
-              <w:lastRenderedPageBreak/>
               <w:t>T_response_serialize</w:t>
             </w:r>
           </w:p>
@@ -10340,6 +10344,7 @@
         <w:rPr>
           <w:lang w:val="fr-FR"/>
         </w:rPr>
+        <w:lastRenderedPageBreak/>
         <w:t>5.2.2.3. Instrumentation au Niveau Inference</w:t>
       </w:r>
     </w:p>
@@ -10772,7 +10777,6 @@
         <w:rPr>
           <w:lang w:val="fr-FR"/>
         </w:rPr>
-        <w:lastRenderedPageBreak/>
         <w:t xml:space="preserve">Le décorateur </w:t>
       </w:r>
       <w:r>
@@ -11406,6 +11410,7 @@
       <w:bookmarkStart w:id="44" w:name="instrumentation-au-niveau-middleware"/>
       <w:bookmarkEnd w:id="43"/>
       <w:r>
+        <w:lastRenderedPageBreak/>
         <w:t>5.2.2.4. Instrumentation au Niveau Middleware</w:t>
       </w:r>
     </w:p>
@@ -11742,7 +11747,6 @@
         <w:rPr>
           <w:lang w:val="fr-FR"/>
         </w:rPr>
-        <w:lastRenderedPageBreak/>
         <w:t>Cette métrique est exposée au client et permet de mesurer la latence visible depuis l’extérieur.</w:t>
       </w:r>
     </w:p>
@@ -12533,6 +12537,7 @@
       <w:bookmarkStart w:id="46" w:name="streaming-granularité-token-par-token"/>
       <w:bookmarkEnd w:id="45"/>
       <w:r>
+        <w:lastRenderedPageBreak/>
         <w:t>5.2.2.6. Streaming : Granularité Token-Par-Token</w:t>
       </w:r>
     </w:p>
@@ -12745,7 +12750,6 @@
               <w:pStyle w:val="Compact"/>
             </w:pPr>
             <w:r>
-              <w:lastRenderedPageBreak/>
               <w:t>Source</w:t>
             </w:r>
           </w:p>
@@ -13246,6 +13250,7 @@
         <w:rPr>
           <w:lang w:val="fr-FR"/>
         </w:rPr>
+        <w:lastRenderedPageBreak/>
         <w:t>5.3. Limites du POC</w:t>
       </w:r>
     </w:p>
@@ -13355,7 +13360,6 @@
         <w:rPr>
           <w:lang w:val="fr-FR"/>
         </w:rPr>
-        <w:lastRenderedPageBreak/>
         <w:t>6. Conclusion et Prochaines Étapes</w:t>
       </w:r>
     </w:p>
@@ -15151,6 +15155,27 @@
       <w:sz w:val="22"/>
     </w:rPr>
   </w:style>
+  <w:style w:type="character" w:styleId="UnresolvedMention">
+    <w:name w:val="Unresolved Mention"/>
+    <w:basedOn w:val="DefaultParagraphFont"/>
+    <w:uiPriority w:val="99"/>
+    <w:semiHidden/>
+    <w:unhideWhenUsed/>
+    <w:rsid w:val="00322079"/>
+    <w:rPr>
+      <w:color w:val="605E5C"/>
+      <w:shd w:val="clear" w:color="auto" w:fill="E1DFDD"/>
+    </w:rPr>
+  </w:style>
+  <w:style w:type="character" w:styleId="FollowedHyperlink">
+    <w:name w:val="FollowedHyperlink"/>
+    <w:basedOn w:val="DefaultParagraphFont"/>
+    <w:rsid w:val="00322079"/>
+    <w:rPr>
+      <w:color w:val="96607D" w:themeColor="followedHyperlink"/>
+      <w:u w:val="single"/>
+    </w:rPr>
+  </w:style>
 </w:styles>
 </file>
 

</xml_diff>